<commit_message>
continuing where i left off fixed processor and modified appropriate function to move diagonally witha trapozoidal i.e. ramp movement.
</commit_message>
<xml_diff>
--- a/Test Development for methods .docx
+++ b/Test Development for methods .docx
@@ -86,12 +86,84 @@
         <w:t>Test serial strings</w:t>
       </w:r>
     </w:p>
+    <w:p/>
     <w:p>
-      <w:pPr>
-        <w:ind w:left="1440"/>
-      </w:pPr>
-      <w:r>
-        <w:tab/>
+      <w:r>
+        <w:t>Receive Gcode command</w:t>
+      </w:r>
+    </w:p>
+    <w:p>
+      <w:r>
+        <w:t xml:space="preserve">Srerial cmd:  “G0 X10 Y20 F1500” </w:t>
+      </w:r>
+      <w:r>
+        <w:sym w:font="Wingdings" w:char="F0E0"/>
+      </w:r>
+      <w:r>
+        <w:t xml:space="preserve"> commandParser.parseCommand(“G0 X10 Y20 F1500”, “ ”, cmdArr) </w:t>
+      </w:r>
+      <w:r>
+        <w:sym w:font="Wingdings" w:char="F0E0"/>
+      </w:r>
+      <w:r>
+        <w:t xml:space="preserve"> cmdArr = [“G0”, “X10”, “Y20”, “F1500”] </w:t>
+      </w:r>
+      <w:r>
+        <w:sym w:font="Wingdings" w:char="F0E0"/>
+      </w:r>
+      <w:r>
+        <w:t xml:space="preserve">  commandParser.validateCommand(cmdArr[0]) (validates main command) </w:t>
+      </w:r>
+      <w:r>
+        <w:sym w:font="Wingdings" w:char="F0E0"/>
+      </w:r>
+      <w:r>
+        <w:t xml:space="preserve"> CommandParser.</w:t>
+      </w:r>
+    </w:p>
+    <w:p/>
+    <w:p>
+      <w:r>
+        <w:t xml:space="preserve">Parser.validateCommandParts( cmdArr) : checks that the elements </w:t>
+      </w:r>
+      <w:r>
+        <w:t xml:space="preserve">in cmd array are valid. </w:t>
+      </w:r>
+    </w:p>
+    <w:p>
+      <w:pPr>
+        <w:pStyle w:val="ListParagraph"/>
+        <w:numPr>
+          <w:ilvl w:val="0"/>
+          <w:numId w:val="1"/>
+        </w:numPr>
+      </w:pPr>
+      <w:r>
+        <w:t xml:space="preserve">Starting from cmdArr[1] we iterate </w:t>
+      </w:r>
+    </w:p>
+    <w:p>
+      <w:pPr>
+        <w:pStyle w:val="ListParagraph"/>
+        <w:numPr>
+          <w:ilvl w:val="1"/>
+          <w:numId w:val="1"/>
+        </w:numPr>
+      </w:pPr>
+      <w:r>
+        <w:t xml:space="preserve">if main command is part of commands that require arguments </w:t>
+      </w:r>
+    </w:p>
+    <w:p>
+      <w:pPr>
+        <w:pStyle w:val="ListParagraph"/>
+        <w:numPr>
+          <w:ilvl w:val="0"/>
+          <w:numId w:val="1"/>
+        </w:numPr>
+      </w:pPr>
+      <w:r>
+        <w:t xml:space="preserve">If cmdCheck if cmdArr[i][0] is </w:t>
       </w:r>
     </w:p>
     <w:sectPr>
@@ -122,7 +194,7 @@
         <w:rFonts w:ascii="Symbol" w:eastAsiaTheme="minorHAnsi" w:hAnsi="Symbol" w:cstheme="minorBidi" w:hint="default"/>
       </w:rPr>
     </w:lvl>
-    <w:lvl w:ilvl="1" w:tplc="04090003" w:tentative="1">
+    <w:lvl w:ilvl="1" w:tplc="04090003">
       <w:start w:val="1"/>
       <w:numFmt w:val="bullet"/>
       <w:lvlText w:val="o"/>

</xml_diff>